<commit_message>
Refine FMA validation and attribution workflows
</commit_message>
<xml_diff>
--- a/paper/information_sciences_submission/final_package/Highlights.docx
+++ b/paper/information_sciences_submission/final_package/Highlights.docx
@@ -4,114 +4,76 @@
   <w:body>
     <w:p>
       <w:pPr>
-        <w:spacing w:after="160"/>
+        <w:spacing w:after="120"/>
         <w:jc w:val="center"/>
       </w:pPr>
       <w:r>
         <w:rPr>
-          <w:rFonts w:ascii="Times New Roman" w:hAnsi="Times New Roman"/>
+          <w:rFonts w:ascii="Times New Roman" w:hAnsi="Times New Roman" w:eastAsia="Times New Roman"/>
           <w:b/>
-          <w:sz w:val="22"/>
+          <w:sz w:val="28"/>
         </w:rPr>
         <w:t>Highlights</w:t>
       </w:r>
     </w:p>
     <w:p>
       <w:pPr>
-        <w:spacing w:after="80"/>
-        <w:jc w:val="center"/>
+        <w:spacing w:after="120"/>
       </w:pPr>
       <w:r>
         <w:rPr>
-          <w:rFonts w:ascii="Times New Roman" w:hAnsi="Times New Roman"/>
-          <w:b/>
+          <w:rFonts w:ascii="Times New Roman" w:hAnsi="Times New Roman" w:eastAsia="Times New Roman"/>
           <w:sz w:val="22"/>
         </w:rPr>
-        <w:t>Structurally-Calibrated Functional Attribution for Audit Prioritization in Knowledge-Intensive Reasoning</w:t>
+        <w:t>Structured audit records organize exposed reasoning and knowledge artifacts.</w:t>
       </w:r>
     </w:p>
     <w:p>
       <w:pPr>
-        <w:spacing w:after="240"/>
-        <w:jc w:val="center"/>
+        <w:spacing w:after="120"/>
       </w:pPr>
       <w:r>
         <w:rPr>
-          <w:rFonts w:ascii="Times New Roman" w:hAnsi="Times New Roman"/>
-          <w:b w:val="0"/>
+          <w:rFonts w:ascii="Times New Roman" w:hAnsi="Times New Roman" w:eastAsia="Times New Roman"/>
           <w:sz w:val="22"/>
         </w:rPr>
-        <w:t>Haoran Ma; Ningning Wang</w:t>
+        <w:t>Graph fields show dependency, redundancy, bottlenecks, and audit reasons.</w:t>
       </w:r>
     </w:p>
     <w:p>
       <w:pPr>
-        <w:pStyle w:val="ListBullet"/>
-        <w:spacing w:after="80"/>
+        <w:spacing w:after="120"/>
       </w:pPr>
       <w:r>
         <w:rPr>
-          <w:rFonts w:ascii="Times New Roman" w:hAnsi="Times New Roman"/>
-          <w:b w:val="0"/>
+          <w:rFonts w:ascii="Times New Roman" w:hAnsi="Times New Roman" w:eastAsia="Times New Roman"/>
           <w:sz w:val="22"/>
         </w:rPr>
-        <w:t>SC-FMA converts intermediate knowledge artifacts into structured audit records for fixed-budget curation.</w:t>
+        <w:t>Locked process annotations test fidelity tracking under audit budgets.</w:t>
       </w:r>
     </w:p>
     <w:p>
       <w:pPr>
-        <w:pStyle w:val="ListBullet"/>
-        <w:spacing w:after="80"/>
+        <w:spacing w:after="120"/>
       </w:pPr>
       <w:r>
         <w:rPr>
-          <w:rFonts w:ascii="Times New Roman" w:hAnsi="Times New Roman"/>
-          <w:b w:val="0"/>
+          <w:rFonts w:ascii="Times New Roman" w:hAnsi="Times New Roman" w:eastAsia="Times New Roman"/>
           <w:sz w:val="22"/>
         </w:rPr>
-        <w:t>Graph-aware representation fields record fidelity, structural dependency, redundancy, bottleneck exposure, and maintenance actions.</w:t>
+        <w:t>A country knowledge graph shows relation-aware dependency shifts.</w:t>
       </w:r>
     </w:p>
     <w:p>
       <w:pPr>
-        <w:pStyle w:val="ListBullet"/>
-        <w:spacing w:after="80"/>
+        <w:spacing w:after="120"/>
       </w:pPr>
       <w:r>
         <w:rPr>
-          <w:rFonts w:ascii="Times New Roman" w:hAnsi="Times New Roman"/>
-          <w:b w:val="0"/>
+          <w:rFonts w:ascii="Times New Roman" w:hAnsi="Times New Roman" w:eastAsia="Times New Roman"/>
           <w:sz w:val="22"/>
         </w:rPr>
-        <w:t>The PRM800K process-annotation dataset is used to analyze annotation-order preservation as representation behavior under an audit budget.</w:t>
-      </w:r>
-    </w:p>
-    <w:p>
-      <w:pPr>
-        <w:pStyle w:val="ListBullet"/>
-        <w:spacing w:after="80"/>
-      </w:pPr>
-      <w:r>
-        <w:rPr>
-          <w:rFonts w:ascii="Times New Roman" w:hAnsi="Times New Roman"/>
-          <w:b w:val="0"/>
-          <w:sz w:val="22"/>
-        </w:rPr>
-        <w:t>A Countries-KG diagnostic graph shows how typed relations alter structural-dependency allocation.</w:t>
-      </w:r>
-    </w:p>
-    <w:p>
-      <w:pPr>
-        <w:pStyle w:val="ListBullet"/>
-        <w:spacing w:after="80"/>
-      </w:pPr>
-      <w:r>
-        <w:rPr>
-          <w:rFonts w:ascii="Times New Roman" w:hAnsi="Times New Roman"/>
-          <w:b w:val="0"/>
-          <w:sz w:val="22"/>
-        </w:rPr>
-        <w:t>Audit-record construction supports fixed-budget knowledge maintenance, curation, and reuse.</w:t>
+        <w:t>Raw-field controls separate field effects from SCU calibration.</w:t>
       </w:r>
     </w:p>
     <w:sectPr>
@@ -488,7 +450,7 @@
     <w:qFormat/>
     <w:rsid w:val="00FC693F"/>
     <w:rPr>
-      <w:rFonts w:ascii="Times New Roman" w:hAnsi="Times New Roman"/>
+      <w:rFonts w:ascii="Times New Roman" w:hAnsi="Times New Roman" w:eastAsia="Times New Roman"/>
       <w:sz w:val="22"/>
     </w:rPr>
   </w:style>

</xml_diff>